<commit_message>
fix(compiler): resilient COM handshake and recycling
- Wrap paste with retry and source re-copy on COM error 4605 across
  compiler and slicer with 50ms settling delay
- Sanitize panel names in MultiPartPartitionPolicy chunk paths
- Recycle Word COM process per substation in full and quick reports
- Refactor _SubstationExecutionContext and export clear_windows_clipboard
- Include intentional template update for swg-panel.docx

Closes #63, #64, #65
</commit_message>
<xml_diff>
--- a/templates/FULL REPORT/NORMAL IR US TEV/swg-panel.docx
+++ b/templates/FULL REPORT/NORMAL IR US TEV/swg-panel.docx
@@ -161,7 +161,21 @@
               <w:rPr>
                 <w:rFonts w:ascii="Calibri" w:eastAsia="Calibri" w:hAnsi="Calibri" w:cs="Calibri"/>
               </w:rPr>
-              <w:t>{{ substation.name_erms }}</w:t>
+              <w:t xml:space="preserve">{{ </w:t>
+            </w:r>
+            <w:proofErr w:type="spellStart"/>
+            <w:r>
+              <w:rPr>
+                <w:rFonts w:ascii="Calibri" w:eastAsia="Calibri" w:hAnsi="Calibri" w:cs="Calibri"/>
+              </w:rPr>
+              <w:t>substation.name_erms</w:t>
+            </w:r>
+            <w:proofErr w:type="spellEnd"/>
+            <w:r>
+              <w:rPr>
+                <w:rFonts w:ascii="Calibri" w:eastAsia="Calibri" w:hAnsi="Calibri" w:cs="Calibri"/>
+              </w:rPr>
+              <w:t xml:space="preserve"> }}</w:t>
             </w:r>
           </w:p>
         </w:tc>
@@ -183,7 +197,21 @@
               <w:rPr>
                 <w:rFonts w:ascii="Calibri" w:eastAsia="Calibri" w:hAnsi="Calibri" w:cs="Calibri"/>
               </w:rPr>
-              <w:t>Date: {{ substation.date }}</w:t>
+              <w:t xml:space="preserve">Date: {{ </w:t>
+            </w:r>
+            <w:proofErr w:type="spellStart"/>
+            <w:r>
+              <w:rPr>
+                <w:rFonts w:ascii="Calibri" w:eastAsia="Calibri" w:hAnsi="Calibri" w:cs="Calibri"/>
+              </w:rPr>
+              <w:t>substation.date</w:t>
+            </w:r>
+            <w:proofErr w:type="spellEnd"/>
+            <w:r>
+              <w:rPr>
+                <w:rFonts w:ascii="Calibri" w:eastAsia="Calibri" w:hAnsi="Calibri" w:cs="Calibri"/>
+              </w:rPr>
+              <w:t xml:space="preserve"> }}</w:t>
             </w:r>
           </w:p>
         </w:tc>
@@ -249,7 +277,21 @@
               <w:rPr>
                 <w:rFonts w:ascii="Calibri" w:eastAsia="Calibri" w:hAnsi="Calibri" w:cs="Calibri"/>
               </w:rPr>
-              <w:t>{{ swg.type }}</w:t>
+              <w:t xml:space="preserve">{{ </w:t>
+            </w:r>
+            <w:proofErr w:type="spellStart"/>
+            <w:r>
+              <w:rPr>
+                <w:rFonts w:ascii="Calibri" w:eastAsia="Calibri" w:hAnsi="Calibri" w:cs="Calibri"/>
+              </w:rPr>
+              <w:t>swg.type</w:t>
+            </w:r>
+            <w:proofErr w:type="spellEnd"/>
+            <w:r>
+              <w:rPr>
+                <w:rFonts w:ascii="Calibri" w:eastAsia="Calibri" w:hAnsi="Calibri" w:cs="Calibri"/>
+              </w:rPr>
+              <w:t xml:space="preserve"> }}</w:t>
             </w:r>
           </w:p>
         </w:tc>
@@ -293,7 +335,21 @@
               <w:rPr>
                 <w:rFonts w:cstheme="minorHAnsi"/>
               </w:rPr>
-              <w:t>{{ swg.manufacturer }}</w:t>
+              <w:t xml:space="preserve">{{ </w:t>
+            </w:r>
+            <w:proofErr w:type="spellStart"/>
+            <w:r>
+              <w:rPr>
+                <w:rFonts w:cstheme="minorHAnsi"/>
+              </w:rPr>
+              <w:t>swg.manufacturer</w:t>
+            </w:r>
+            <w:proofErr w:type="spellEnd"/>
+            <w:r>
+              <w:rPr>
+                <w:rFonts w:cstheme="minorHAnsi"/>
+              </w:rPr>
+              <w:t xml:space="preserve"> }}</w:t>
             </w:r>
           </w:p>
         </w:tc>
@@ -315,7 +371,21 @@
               <w:rPr>
                 <w:rFonts w:cstheme="minorHAnsi"/>
               </w:rPr>
-              <w:t>Time: {{ substation.time }}</w:t>
+              <w:t xml:space="preserve">Time: {{ </w:t>
+            </w:r>
+            <w:proofErr w:type="spellStart"/>
+            <w:r>
+              <w:rPr>
+                <w:rFonts w:cstheme="minorHAnsi"/>
+              </w:rPr>
+              <w:t>substation.time</w:t>
+            </w:r>
+            <w:proofErr w:type="spellEnd"/>
+            <w:r>
+              <w:rPr>
+                <w:rFonts w:cstheme="minorHAnsi"/>
+              </w:rPr>
+              <w:t xml:space="preserve"> }}</w:t>
             </w:r>
           </w:p>
         </w:tc>
@@ -379,7 +449,21 @@
               <w:rPr>
                 <w:rFonts w:ascii="Calibri" w:eastAsia="Calibri" w:hAnsi="Calibri" w:cs="Calibri"/>
               </w:rPr>
-              <w:t>{{ swg.model }}</w:t>
+              <w:t xml:space="preserve">{{ </w:t>
+            </w:r>
+            <w:proofErr w:type="spellStart"/>
+            <w:r>
+              <w:rPr>
+                <w:rFonts w:ascii="Calibri" w:eastAsia="Calibri" w:hAnsi="Calibri" w:cs="Calibri"/>
+              </w:rPr>
+              <w:t>swg.model</w:t>
+            </w:r>
+            <w:proofErr w:type="spellEnd"/>
+            <w:r>
+              <w:rPr>
+                <w:rFonts w:ascii="Calibri" w:eastAsia="Calibri" w:hAnsi="Calibri" w:cs="Calibri"/>
+              </w:rPr>
+              <w:t xml:space="preserve"> }}</w:t>
             </w:r>
           </w:p>
         </w:tc>
@@ -424,7 +508,23 @@
                 <w:rFonts w:cstheme="minorHAnsi"/>
                 <w:color w:val="000000"/>
               </w:rPr>
-              <w:t>{{ swg.rating }}</w:t>
+              <w:t xml:space="preserve">{{ </w:t>
+            </w:r>
+            <w:proofErr w:type="spellStart"/>
+            <w:r>
+              <w:rPr>
+                <w:rFonts w:cstheme="minorHAnsi"/>
+                <w:color w:val="000000"/>
+              </w:rPr>
+              <w:t>swg.rating</w:t>
+            </w:r>
+            <w:proofErr w:type="spellEnd"/>
+            <w:r>
+              <w:rPr>
+                <w:rFonts w:cstheme="minorHAnsi"/>
+                <w:color w:val="000000"/>
+              </w:rPr>
+              <w:t xml:space="preserve"> }}</w:t>
             </w:r>
           </w:p>
         </w:tc>
@@ -446,7 +546,21 @@
               <w:rPr>
                 <w:rFonts w:cstheme="minorHAnsi"/>
               </w:rPr>
-              <w:t>Humidity: {{ substation.humidity }}</w:t>
+              <w:t xml:space="preserve">Humidity: {{ </w:t>
+            </w:r>
+            <w:proofErr w:type="spellStart"/>
+            <w:r>
+              <w:rPr>
+                <w:rFonts w:cstheme="minorHAnsi"/>
+              </w:rPr>
+              <w:t>substation.humidity</w:t>
+            </w:r>
+            <w:proofErr w:type="spellEnd"/>
+            <w:r>
+              <w:rPr>
+                <w:rFonts w:cstheme="minorHAnsi"/>
+              </w:rPr>
+              <w:t xml:space="preserve"> }}</w:t>
             </w:r>
           </w:p>
         </w:tc>
@@ -510,7 +624,21 @@
               <w:rPr>
                 <w:rFonts w:ascii="Calibri" w:eastAsia="Calibri" w:hAnsi="Calibri" w:cs="Calibri"/>
               </w:rPr>
-              <w:t>{{ panel.area }}</w:t>
+              <w:t xml:space="preserve">{{ </w:t>
+            </w:r>
+            <w:proofErr w:type="spellStart"/>
+            <w:r>
+              <w:rPr>
+                <w:rFonts w:ascii="Calibri" w:eastAsia="Calibri" w:hAnsi="Calibri" w:cs="Calibri"/>
+              </w:rPr>
+              <w:t>panel.area</w:t>
+            </w:r>
+            <w:proofErr w:type="spellEnd"/>
+            <w:r>
+              <w:rPr>
+                <w:rFonts w:ascii="Calibri" w:eastAsia="Calibri" w:hAnsi="Calibri" w:cs="Calibri"/>
+              </w:rPr>
+              <w:t xml:space="preserve"> }}</w:t>
             </w:r>
           </w:p>
         </w:tc>
@@ -554,7 +682,21 @@
               <w:rPr>
                 <w:rFonts w:cstheme="minorHAnsi"/>
               </w:rPr>
-              <w:t>{{ panel.linknumber }}</w:t>
+              <w:t xml:space="preserve">{{ </w:t>
+            </w:r>
+            <w:proofErr w:type="spellStart"/>
+            <w:r>
+              <w:rPr>
+                <w:rFonts w:cstheme="minorHAnsi"/>
+              </w:rPr>
+              <w:t>panel.linknumber</w:t>
+            </w:r>
+            <w:proofErr w:type="spellEnd"/>
+            <w:r>
+              <w:rPr>
+                <w:rFonts w:cstheme="minorHAnsi"/>
+              </w:rPr>
+              <w:t xml:space="preserve"> }}</w:t>
             </w:r>
           </w:p>
         </w:tc>
@@ -983,10 +1125,10 @@
                   <v:path o:extrusionok="f" gradientshapeok="t" o:connecttype="rect"/>
                   <o:lock v:ext="edit" aspectratio="t"/>
                 </v:shapetype>
-                <v:shape id="_x0000_i1029" type="#_x0000_t75" style="width:237.6pt;height:147.6pt" o:ole="">
+                <v:shape id="_x0000_i1032" type="#_x0000_t75" style="width:237.55pt;height:148.05pt" o:ole="">
                   <v:imagedata r:id="rId7" o:title="" croptop="1206f" cropbottom="3617f" cropleft="781f" cropright="781f"/>
                 </v:shape>
-                <w:control r:id="rId8" w:name="CIRViewer1211111131211" w:shapeid="_x0000_i1029"/>
+                <w:control r:id="rId8" w:name="CIRViewer1211111131211" w:shapeid="_x0000_i1032"/>
               </w:object>
             </w:r>
           </w:p>
@@ -1057,75 +1199,22 @@
             <w:r>
               <w:rPr>
                 <w:rFonts w:ascii="Calibri" w:eastAsia="Calibri" w:hAnsi="Calibri" w:cs="Calibri"/>
-                <w:noProof/>
-              </w:rPr>
-              <mc:AlternateContent>
-                <mc:Choice Requires="wps">
-                  <w:drawing>
-                    <wp:anchor distT="0" distB="0" distL="114300" distR="114300" simplePos="0" relativeHeight="251659264" behindDoc="0" locked="0" layoutInCell="1" allowOverlap="1" wp14:anchorId="6C1DB093" wp14:editId="4A0BD669">
-                      <wp:simplePos x="0" y="0"/>
-                      <wp:positionH relativeFrom="column">
-                        <wp:posOffset>1750060</wp:posOffset>
-                      </wp:positionH>
-                      <wp:positionV relativeFrom="paragraph">
-                        <wp:posOffset>-692785</wp:posOffset>
-                      </wp:positionV>
-                      <wp:extent cx="485140" cy="344805"/>
-                      <wp:effectExtent l="0" t="0" r="10160" b="17145"/>
-                      <wp:wrapNone/>
-                      <wp:docPr id="1154606686" name="Rectangle 13"/>
-                      <wp:cNvGraphicFramePr/>
-                      <a:graphic xmlns:a="http://schemas.openxmlformats.org/drawingml/2006/main">
-                        <a:graphicData uri="http://schemas.microsoft.com/office/word/2010/wordprocessingShape">
-                          <wps:wsp>
-                            <wps:cNvSpPr/>
-                            <wps:spPr>
-                              <a:xfrm>
-                                <a:off x="0" y="0"/>
-                                <a:ext cx="485140" cy="344805"/>
-                              </a:xfrm>
-                              <a:prstGeom prst="rect">
-                                <a:avLst/>
-                              </a:prstGeom>
-                              <a:noFill/>
-                              <a:ln w="25400" cap="flat" cmpd="sng" algn="ctr">
-                                <a:solidFill>
-                                  <a:srgbClr val="FFFF00"/>
-                                </a:solidFill>
-                                <a:prstDash val="solid"/>
-                              </a:ln>
-                              <a:effectLst/>
-                            </wps:spPr>
-                            <wps:bodyPr rot="0" spcFirstLastPara="0" vertOverflow="overflow" horzOverflow="overflow" vert="horz" wrap="square" lIns="91440" tIns="45720" rIns="91440" bIns="45720" numCol="1" spcCol="0" rtlCol="0" fromWordArt="0" anchor="ctr" anchorCtr="0" forceAA="0" compatLnSpc="1">
-                              <a:prstTxWarp prst="textNoShape">
-                                <a:avLst/>
-                              </a:prstTxWarp>
-                              <a:noAutofit/>
-                            </wps:bodyPr>
-                          </wps:wsp>
-                        </a:graphicData>
-                      </a:graphic>
-                      <wp14:sizeRelH relativeFrom="margin">
-                        <wp14:pctWidth>0</wp14:pctWidth>
-                      </wp14:sizeRelH>
-                      <wp14:sizeRelV relativeFrom="margin">
-                        <wp14:pctHeight>0</wp14:pctHeight>
-                      </wp14:sizeRelV>
-                    </wp:anchor>
-                  </w:drawing>
-                </mc:Choice>
-                <mc:Fallback>
-                  <w:pict>
-                    <v:rect w14:anchorId="3A39E2C9" id="Rectangle 13" o:spid="_x0000_s1026" style="position:absolute;margin-left:137.8pt;margin-top:-54.55pt;width:38.2pt;height:27.15pt;z-index:251659264;visibility:visible;mso-wrap-style:square;mso-width-percent:0;mso-height-percent:0;mso-wrap-distance-left:9pt;mso-wrap-distance-top:0;mso-wrap-distance-right:9pt;mso-wrap-distance-bottom:0;mso-position-horizontal:absolute;mso-position-horizontal-relative:text;mso-position-vertical:absolute;mso-position-vertical-relative:text;mso-width-percent:0;mso-height-percent:0;mso-width-relative:margin;mso-height-relative:margin;v-text-anchor:middle" o:gfxdata="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" filled="f" strokecolor="yellow" strokeweight="2pt"/>
-                  </w:pict>
-                </mc:Fallback>
-              </mc:AlternateContent>
-            </w:r>
-            <w:r>
-              <w:rPr>
-                <w:rFonts w:ascii="Calibri" w:eastAsia="Calibri" w:hAnsi="Calibri" w:cs="Calibri"/>
-              </w:rPr>
-              <w:t>{{ visual.image }}</w:t>
+              </w:rPr>
+              <w:t xml:space="preserve">{{ </w:t>
+            </w:r>
+            <w:proofErr w:type="spellStart"/>
+            <w:r>
+              <w:rPr>
+                <w:rFonts w:ascii="Calibri" w:eastAsia="Calibri" w:hAnsi="Calibri" w:cs="Calibri"/>
+              </w:rPr>
+              <w:t>visual.image</w:t>
+            </w:r>
+            <w:proofErr w:type="spellEnd"/>
+            <w:r>
+              <w:rPr>
+                <w:rFonts w:ascii="Calibri" w:eastAsia="Calibri" w:hAnsi="Calibri" w:cs="Calibri"/>
+              </w:rPr>
+              <w:t xml:space="preserve"> }}</w:t>
             </w:r>
           </w:p>
         </w:tc>
@@ -1452,7 +1541,7 @@
                 <w:sz w:val="20"/>
                 <w:szCs w:val="18"/>
               </w:rPr>
-              <w:instrText xml:space="preserve">DOCVARIABLE _Fd1248700605 \* MERGEFORMAT </w:instrText>
+              <w:instrText xml:space="preserve">DOCVARIABLE _Fd1967887225 \* MERGEFORMAT </w:instrText>
             </w:r>
             <w:r>
               <w:rPr>
@@ -1468,7 +1557,7 @@
                 <w:sz w:val="20"/>
                 <w:szCs w:val="18"/>
               </w:rPr>
-              <w:t xml:space="preserve">46.5 °C </w:t>
+              <w:t xml:space="preserve">46.1 °C </w:t>
             </w:r>
             <w:r>
               <w:rPr>
@@ -1645,7 +1734,7 @@
                 <w:sz w:val="20"/>
                 <w:szCs w:val="18"/>
               </w:rPr>
-              <w:instrText xml:space="preserve">DOCVARIABLE _Fd1212118283 \* MERGEFORMAT </w:instrText>
+              <w:instrText xml:space="preserve">DOCVARIABLE _Fd81475520 \* MERGEFORMAT </w:instrText>
             </w:r>
             <w:r>
               <w:rPr>
@@ -1661,7 +1750,7 @@
                 <w:sz w:val="20"/>
                 <w:szCs w:val="18"/>
               </w:rPr>
-              <w:t xml:space="preserve">45.0 °C </w:t>
+              <w:t xml:space="preserve">45.4 °C </w:t>
             </w:r>
             <w:r>
               <w:rPr>
@@ -1742,7 +1831,25 @@
                 <w:sz w:val="20"/>
                 <w:szCs w:val="18"/>
               </w:rPr>
-              <w:t>{{ panel.serialnumber }}</w:t>
+              <w:t xml:space="preserve">{{ </w:t>
+            </w:r>
+            <w:proofErr w:type="spellStart"/>
+            <w:r>
+              <w:rPr>
+                <w:rFonts w:ascii="Calibri" w:eastAsia="Calibri" w:hAnsi="Calibri" w:cs="Calibri"/>
+                <w:sz w:val="20"/>
+                <w:szCs w:val="18"/>
+              </w:rPr>
+              <w:t>panel.serialnumber</w:t>
+            </w:r>
+            <w:proofErr w:type="spellEnd"/>
+            <w:r>
+              <w:rPr>
+                <w:rFonts w:ascii="Calibri" w:eastAsia="Calibri" w:hAnsi="Calibri" w:cs="Calibri"/>
+                <w:sz w:val="20"/>
+                <w:szCs w:val="18"/>
+              </w:rPr>
+              <w:t xml:space="preserve"> }}</w:t>
             </w:r>
           </w:p>
         </w:tc>
@@ -1842,7 +1949,7 @@
                 <w:sz w:val="20"/>
                 <w:szCs w:val="18"/>
               </w:rPr>
-              <w:instrText xml:space="preserve">DOCVARIABLE _Fd595584509 \* MERGEFORMAT </w:instrText>
+              <w:instrText xml:space="preserve">DOCVARIABLE _Fd1922861825 \* MERGEFORMAT </w:instrText>
             </w:r>
             <w:r>
               <w:rPr>
@@ -1858,7 +1965,7 @@
                 <w:sz w:val="20"/>
                 <w:szCs w:val="18"/>
               </w:rPr>
-              <w:t xml:space="preserve">45.9 °C </w:t>
+              <w:t xml:space="preserve">- </w:t>
             </w:r>
             <w:r>
               <w:rPr>
@@ -1946,7 +2053,25 @@
                 <w:sz w:val="20"/>
                 <w:szCs w:val="18"/>
               </w:rPr>
-              <w:t>{{ panel.heateramp }}</w:t>
+              <w:t xml:space="preserve">{{ </w:t>
+            </w:r>
+            <w:proofErr w:type="spellStart"/>
+            <w:r>
+              <w:rPr>
+                <w:rFonts w:ascii="Calibri" w:eastAsia="Calibri" w:hAnsi="Calibri" w:cs="Calibri"/>
+                <w:sz w:val="20"/>
+                <w:szCs w:val="18"/>
+              </w:rPr>
+              <w:t>panel.heateramp</w:t>
+            </w:r>
+            <w:proofErr w:type="spellEnd"/>
+            <w:r>
+              <w:rPr>
+                <w:rFonts w:ascii="Calibri" w:eastAsia="Calibri" w:hAnsi="Calibri" w:cs="Calibri"/>
+                <w:sz w:val="20"/>
+                <w:szCs w:val="18"/>
+              </w:rPr>
+              <w:t xml:space="preserve"> }}</w:t>
             </w:r>
           </w:p>
         </w:tc>
@@ -2038,7 +2163,25 @@
                 <w:sz w:val="20"/>
                 <w:szCs w:val="20"/>
               </w:rPr>
-              <w:t>{{ substation.ambient }}</w:t>
+              <w:t xml:space="preserve">{{ </w:t>
+            </w:r>
+            <w:proofErr w:type="spellStart"/>
+            <w:r>
+              <w:rPr>
+                <w:rFonts w:ascii="Calibri" w:eastAsia="Calibri" w:hAnsi="Calibri" w:cs="Calibri"/>
+                <w:sz w:val="20"/>
+                <w:szCs w:val="20"/>
+              </w:rPr>
+              <w:t>substation.ambient</w:t>
+            </w:r>
+            <w:proofErr w:type="spellEnd"/>
+            <w:r>
+              <w:rPr>
+                <w:rFonts w:ascii="Calibri" w:eastAsia="Calibri" w:hAnsi="Calibri" w:cs="Calibri"/>
+                <w:sz w:val="20"/>
+                <w:szCs w:val="20"/>
+              </w:rPr>
+              <w:t xml:space="preserve"> }}</w:t>
             </w:r>
           </w:p>
         </w:tc>
@@ -2111,7 +2254,25 @@
                 <w:sz w:val="20"/>
                 <w:szCs w:val="18"/>
               </w:rPr>
-              <w:t>{{ panel.breakerstatus }}</w:t>
+              <w:t xml:space="preserve">{{ </w:t>
+            </w:r>
+            <w:proofErr w:type="spellStart"/>
+            <w:r>
+              <w:rPr>
+                <w:rFonts w:ascii="Calibri" w:eastAsia="Calibri" w:hAnsi="Calibri" w:cs="Calibri"/>
+                <w:sz w:val="20"/>
+                <w:szCs w:val="18"/>
+              </w:rPr>
+              <w:t>panel.breakerstatus</w:t>
+            </w:r>
+            <w:proofErr w:type="spellEnd"/>
+            <w:r>
+              <w:rPr>
+                <w:rFonts w:ascii="Calibri" w:eastAsia="Calibri" w:hAnsi="Calibri" w:cs="Calibri"/>
+                <w:sz w:val="20"/>
+                <w:szCs w:val="18"/>
+              </w:rPr>
+              <w:t xml:space="preserve"> }}</w:t>
             </w:r>
           </w:p>
         </w:tc>
@@ -2212,7 +2373,7 @@
                 <w:sz w:val="20"/>
                 <w:szCs w:val="20"/>
               </w:rPr>
-              <w:instrText xml:space="preserve">DOCVARIABLE _Fd2083941930 \* MERGEFORMAT </w:instrText>
+              <w:instrText xml:space="preserve">DOCVARIABLE _Fd97091050 \* MERGEFORMAT </w:instrText>
             </w:r>
             <w:r>
               <w:rPr>
@@ -2228,7 +2389,7 @@
                 <w:sz w:val="20"/>
                 <w:szCs w:val="20"/>
               </w:rPr>
-              <w:t xml:space="preserve">1.5 °C </w:t>
+              <w:t xml:space="preserve">0.7 °C </w:t>
             </w:r>
             <w:r>
               <w:rPr>
@@ -2315,7 +2476,25 @@
                 <w:sz w:val="20"/>
                 <w:szCs w:val="18"/>
               </w:rPr>
-              <w:t>{{ panel.busbarposition }}</w:t>
+              <w:t xml:space="preserve">{{ </w:t>
+            </w:r>
+            <w:proofErr w:type="spellStart"/>
+            <w:r>
+              <w:rPr>
+                <w:rFonts w:ascii="Calibri" w:eastAsia="Calibri" w:hAnsi="Calibri" w:cs="Calibri"/>
+                <w:sz w:val="20"/>
+                <w:szCs w:val="18"/>
+              </w:rPr>
+              <w:t>panel.busbarposition</w:t>
+            </w:r>
+            <w:proofErr w:type="spellEnd"/>
+            <w:r>
+              <w:rPr>
+                <w:rFonts w:ascii="Calibri" w:eastAsia="Calibri" w:hAnsi="Calibri" w:cs="Calibri"/>
+                <w:sz w:val="20"/>
+                <w:szCs w:val="18"/>
+              </w:rPr>
+              <w:t xml:space="preserve"> }}</w:t>
             </w:r>
           </w:p>
         </w:tc>
@@ -2407,7 +2586,25 @@
                 <w:sz w:val="20"/>
                 <w:szCs w:val="18"/>
               </w:rPr>
-              <w:t>{{ panel.loadamp }}</w:t>
+              <w:t xml:space="preserve">{{ </w:t>
+            </w:r>
+            <w:proofErr w:type="spellStart"/>
+            <w:r>
+              <w:rPr>
+                <w:rFonts w:ascii="Calibri" w:eastAsia="Calibri" w:hAnsi="Calibri" w:cs="Calibri"/>
+                <w:sz w:val="20"/>
+                <w:szCs w:val="18"/>
+              </w:rPr>
+              <w:t>panel.loadamp</w:t>
+            </w:r>
+            <w:proofErr w:type="spellEnd"/>
+            <w:r>
+              <w:rPr>
+                <w:rFonts w:ascii="Calibri" w:eastAsia="Calibri" w:hAnsi="Calibri" w:cs="Calibri"/>
+                <w:sz w:val="20"/>
+                <w:szCs w:val="18"/>
+              </w:rPr>
+              <w:t xml:space="preserve"> }}</w:t>
             </w:r>
           </w:p>
         </w:tc>
@@ -2486,7 +2683,25 @@
                 <w:sz w:val="20"/>
                 <w:szCs w:val="18"/>
               </w:rPr>
-              <w:t>{{ panel.cabletype }}</w:t>
+              <w:t xml:space="preserve">{{ </w:t>
+            </w:r>
+            <w:proofErr w:type="spellStart"/>
+            <w:r>
+              <w:rPr>
+                <w:rFonts w:ascii="Calibri" w:eastAsia="Calibri" w:hAnsi="Calibri" w:cs="Calibri"/>
+                <w:sz w:val="20"/>
+                <w:szCs w:val="18"/>
+              </w:rPr>
+              <w:t>panel.cabletype</w:t>
+            </w:r>
+            <w:proofErr w:type="spellEnd"/>
+            <w:r>
+              <w:rPr>
+                <w:rFonts w:ascii="Calibri" w:eastAsia="Calibri" w:hAnsi="Calibri" w:cs="Calibri"/>
+                <w:sz w:val="20"/>
+                <w:szCs w:val="18"/>
+              </w:rPr>
+              <w:t xml:space="preserve"> }}</w:t>
             </w:r>
           </w:p>
         </w:tc>
@@ -2584,7 +2799,25 @@
                 <w:sz w:val="20"/>
                 <w:szCs w:val="18"/>
               </w:rPr>
-              <w:t>{{ ir.severity }}</w:t>
+              <w:t xml:space="preserve">{{ </w:t>
+            </w:r>
+            <w:proofErr w:type="spellStart"/>
+            <w:r>
+              <w:rPr>
+                <w:rFonts w:ascii="Calibri" w:eastAsia="Calibri" w:hAnsi="Calibri" w:cs="Calibri"/>
+                <w:sz w:val="20"/>
+                <w:szCs w:val="18"/>
+              </w:rPr>
+              <w:t>ir.severity</w:t>
+            </w:r>
+            <w:proofErr w:type="spellEnd"/>
+            <w:r>
+              <w:rPr>
+                <w:rFonts w:ascii="Calibri" w:eastAsia="Calibri" w:hAnsi="Calibri" w:cs="Calibri"/>
+                <w:sz w:val="20"/>
+                <w:szCs w:val="18"/>
+              </w:rPr>
+              <w:t xml:space="preserve"> }}</w:t>
             </w:r>
           </w:p>
         </w:tc>
@@ -3177,7 +3410,23 @@
                 <w:rFonts w:ascii="Calibri" w:eastAsia="Calibri" w:hAnsi="Calibri" w:cs="Calibri"/>
                 <w:bCs/>
               </w:rPr>
-              <w:t>{{ tev.prpd }}</w:t>
+              <w:t xml:space="preserve">{{ </w:t>
+            </w:r>
+            <w:proofErr w:type="spellStart"/>
+            <w:r>
+              <w:rPr>
+                <w:rFonts w:ascii="Calibri" w:eastAsia="Calibri" w:hAnsi="Calibri" w:cs="Calibri"/>
+                <w:bCs/>
+              </w:rPr>
+              <w:t>tev.prpd</w:t>
+            </w:r>
+            <w:proofErr w:type="spellEnd"/>
+            <w:r>
+              <w:rPr>
+                <w:rFonts w:ascii="Calibri" w:eastAsia="Calibri" w:hAnsi="Calibri" w:cs="Calibri"/>
+                <w:bCs/>
+              </w:rPr>
+              <w:t xml:space="preserve"> }}</w:t>
             </w:r>
           </w:p>
         </w:tc>
@@ -3734,7 +3983,21 @@
               <w:rPr>
                 <w:rFonts w:ascii="Calibri" w:eastAsia="Calibri" w:hAnsi="Calibri" w:cs="Calibri"/>
               </w:rPr>
-              <w:t xml:space="preserve"> {{ us.reading }}dB</w:t>
+              <w:t xml:space="preserve"> {{ </w:t>
+            </w:r>
+            <w:proofErr w:type="spellStart"/>
+            <w:r>
+              <w:rPr>
+                <w:rFonts w:ascii="Calibri" w:eastAsia="Calibri" w:hAnsi="Calibri" w:cs="Calibri"/>
+              </w:rPr>
+              <w:t>us.reading</w:t>
+            </w:r>
+            <w:proofErr w:type="spellEnd"/>
+            <w:r>
+              <w:rPr>
+                <w:rFonts w:ascii="Calibri" w:eastAsia="Calibri" w:hAnsi="Calibri" w:cs="Calibri"/>
+              </w:rPr>
+              <w:t xml:space="preserve"> }}dB</w:t>
             </w:r>
           </w:p>
         </w:tc>
@@ -3970,7 +4233,21 @@
               <w:rPr>
                 <w:rFonts w:ascii="Calibri" w:eastAsia="Calibri" w:hAnsi="Calibri" w:cs="Calibri"/>
               </w:rPr>
-              <w:t xml:space="preserve"> {{ us.char }}</w:t>
+              <w:t xml:space="preserve"> {{ </w:t>
+            </w:r>
+            <w:proofErr w:type="spellStart"/>
+            <w:r>
+              <w:rPr>
+                <w:rFonts w:ascii="Calibri" w:eastAsia="Calibri" w:hAnsi="Calibri" w:cs="Calibri"/>
+              </w:rPr>
+              <w:t>us.char</w:t>
+            </w:r>
+            <w:proofErr w:type="spellEnd"/>
+            <w:r>
+              <w:rPr>
+                <w:rFonts w:ascii="Calibri" w:eastAsia="Calibri" w:hAnsi="Calibri" w:cs="Calibri"/>
+              </w:rPr>
+              <w:t xml:space="preserve"> }}</w:t>
             </w:r>
           </w:p>
         </w:tc>
@@ -4239,7 +4516,21 @@
               <w:rPr>
                 <w:rFonts w:ascii="Calibri" w:eastAsia="Calibri" w:hAnsi="Calibri" w:cs="Calibri"/>
               </w:rPr>
-              <w:t xml:space="preserve"> {{ us.severity }}</w:t>
+              <w:t xml:space="preserve"> {{ </w:t>
+            </w:r>
+            <w:proofErr w:type="spellStart"/>
+            <w:r>
+              <w:rPr>
+                <w:rFonts w:ascii="Calibri" w:eastAsia="Calibri" w:hAnsi="Calibri" w:cs="Calibri"/>
+              </w:rPr>
+              <w:t>us.severity</w:t>
+            </w:r>
+            <w:proofErr w:type="spellEnd"/>
+            <w:r>
+              <w:rPr>
+                <w:rFonts w:ascii="Calibri" w:eastAsia="Calibri" w:hAnsi="Calibri" w:cs="Calibri"/>
+              </w:rPr>
+              <w:t xml:space="preserve"> }}</w:t>
             </w:r>
           </w:p>
         </w:tc>
@@ -4315,7 +4606,25 @@
                 <w:sz w:val="20"/>
                 <w:szCs w:val="20"/>
               </w:rPr>
-              <w:t>{{ tev.reading }}dB</w:t>
+              <w:t xml:space="preserve">{{ </w:t>
+            </w:r>
+            <w:proofErr w:type="spellStart"/>
+            <w:r>
+              <w:rPr>
+                <w:rFonts w:ascii="Calibri" w:eastAsia="Calibri" w:hAnsi="Calibri" w:cs="Calibri"/>
+                <w:sz w:val="20"/>
+                <w:szCs w:val="20"/>
+              </w:rPr>
+              <w:t>tev.reading</w:t>
+            </w:r>
+            <w:proofErr w:type="spellEnd"/>
+            <w:r>
+              <w:rPr>
+                <w:rFonts w:ascii="Calibri" w:eastAsia="Calibri" w:hAnsi="Calibri" w:cs="Calibri"/>
+                <w:sz w:val="20"/>
+                <w:szCs w:val="20"/>
+              </w:rPr>
+              <w:t xml:space="preserve"> }}dB</w:t>
             </w:r>
           </w:p>
         </w:tc>
@@ -4347,7 +4656,25 @@
                 <w:sz w:val="20"/>
                 <w:szCs w:val="20"/>
               </w:rPr>
-              <w:t>{{ tev.ppc }}</w:t>
+              <w:t xml:space="preserve">{{ </w:t>
+            </w:r>
+            <w:proofErr w:type="spellStart"/>
+            <w:r>
+              <w:rPr>
+                <w:rFonts w:ascii="Calibri" w:eastAsia="Calibri" w:hAnsi="Calibri" w:cs="Calibri"/>
+                <w:sz w:val="20"/>
+                <w:szCs w:val="20"/>
+              </w:rPr>
+              <w:t>tev.ppc</w:t>
+            </w:r>
+            <w:proofErr w:type="spellEnd"/>
+            <w:r>
+              <w:rPr>
+                <w:rFonts w:ascii="Calibri" w:eastAsia="Calibri" w:hAnsi="Calibri" w:cs="Calibri"/>
+                <w:sz w:val="20"/>
+                <w:szCs w:val="20"/>
+              </w:rPr>
+              <w:t xml:space="preserve"> }}</w:t>
             </w:r>
           </w:p>
         </w:tc>
@@ -4379,7 +4706,25 @@
                 <w:sz w:val="20"/>
                 <w:szCs w:val="20"/>
               </w:rPr>
-              <w:t>{{ tev.severity }}</w:t>
+              <w:t xml:space="preserve">{{ </w:t>
+            </w:r>
+            <w:proofErr w:type="spellStart"/>
+            <w:r>
+              <w:rPr>
+                <w:rFonts w:ascii="Calibri" w:eastAsia="Calibri" w:hAnsi="Calibri" w:cs="Calibri"/>
+                <w:sz w:val="20"/>
+                <w:szCs w:val="20"/>
+              </w:rPr>
+              <w:t>tev.severity</w:t>
+            </w:r>
+            <w:proofErr w:type="spellEnd"/>
+            <w:r>
+              <w:rPr>
+                <w:rFonts w:ascii="Calibri" w:eastAsia="Calibri" w:hAnsi="Calibri" w:cs="Calibri"/>
+                <w:sz w:val="20"/>
+                <w:szCs w:val="20"/>
+              </w:rPr>
+              <w:t xml:space="preserve"> }}</w:t>
             </w:r>
           </w:p>
         </w:tc>

</xml_diff>